<commit_message>
health mointoring page completed!!
</commit_message>
<xml_diff>
--- a/AuralAid_QA_Plan updated.docx
+++ b/AuralAid_QA_Plan updated.docx
@@ -13,6 +13,15 @@
           <w:sz w:val="44"/>
         </w:rPr>
       </w:pPr>
+      <w:r>
+        <w:rPr>
+          <w:rFonts w:ascii="Aptos Display" w:hAnsi="Aptos Display"/>
+          <w:b/>
+          <w:color w:val="1F4E79"/>
+          <w:sz w:val="44"/>
+        </w:rPr>
+        <w:t xml:space="preserve">Updated </w:t>
+      </w:r>
       <w:r>
         <w:rPr>
           <w:rFonts w:ascii="Aptos Display" w:hAnsi="Aptos Display"/>
@@ -375,23 +384,7 @@
           <w:sz w:val="32"/>
           <w:szCs w:val="32"/>
         </w:rPr>
-        <w:t xml:space="preserve">Hitec University </w:t>
-      </w:r>
-      <w:r>
-        <w:rPr>
-          <w:b/>
-          <w:sz w:val="32"/>
-          <w:szCs w:val="32"/>
-        </w:rPr>
-        <w:t>T</w:t>
-      </w:r>
-      <w:r>
-        <w:rPr>
-          <w:b/>
-          <w:sz w:val="32"/>
-          <w:szCs w:val="32"/>
-        </w:rPr>
-        <w:t>axila</w:t>
+        <w:t>Hitec University Taxila</w:t>
       </w:r>
     </w:p>
     <w:p>
@@ -4058,6 +4051,7 @@
               <w:spacing w:after="0" w:line="240" w:lineRule="auto"/>
             </w:pPr>
             <w:r>
+              <w:lastRenderedPageBreak/>
               <w:t>TC-4</w:t>
             </w:r>
           </w:p>
@@ -4079,11 +4073,7 @@
               <w:spacing w:after="0" w:line="240" w:lineRule="auto"/>
             </w:pPr>
             <w:r>
-              <w:t xml:space="preserve">Speech </w:t>
-            </w:r>
-            <w:r>
-              <w:lastRenderedPageBreak/>
-              <w:t>Preservation</w:t>
+              <w:t>Speech Preservation</w:t>
             </w:r>
           </w:p>
         </w:tc>
@@ -4104,12 +4094,7 @@
               <w:spacing w:after="0" w:line="240" w:lineRule="auto"/>
             </w:pPr>
             <w:r>
-              <w:lastRenderedPageBreak/>
-              <w:t xml:space="preserve">Ensure DSP does </w:t>
-            </w:r>
-            <w:r>
-              <w:lastRenderedPageBreak/>
-              <w:t>not overly suppress low-volume speech.</w:t>
+              <w:t>Ensure DSP does not overly suppress low-volume speech.</w:t>
             </w:r>
           </w:p>
         </w:tc>
@@ -4130,12 +4115,7 @@
               <w:spacing w:after="0" w:line="240" w:lineRule="auto"/>
             </w:pPr>
             <w:r>
-              <w:lastRenderedPageBreak/>
-              <w:t xml:space="preserve">1. Play soft speech </w:t>
-            </w:r>
-            <w:r>
-              <w:lastRenderedPageBreak/>
-              <w:t>samples. 2. Run pipeline.</w:t>
+              <w:t>1. Play soft speech samples. 2. Run pipeline.</w:t>
             </w:r>
           </w:p>
         </w:tc>
@@ -4156,12 +4136,7 @@
               <w:spacing w:after="0" w:line="240" w:lineRule="auto"/>
             </w:pPr>
             <w:r>
-              <w:lastRenderedPageBreak/>
-              <w:t xml:space="preserve">Important speech remains </w:t>
-            </w:r>
-            <w:r>
-              <w:lastRenderedPageBreak/>
-              <w:t>intelligible after filtering.</w:t>
+              <w:t>Important speech remains intelligible after filtering.</w:t>
             </w:r>
           </w:p>
         </w:tc>
@@ -4182,7 +4157,6 @@
               <w:spacing w:after="0" w:line="240" w:lineRule="auto"/>
             </w:pPr>
             <w:r>
-              <w:lastRenderedPageBreak/>
               <w:t>Planned</w:t>
             </w:r>
           </w:p>
@@ -7559,6 +7533,7 @@
               <w:spacing w:after="0" w:line="240" w:lineRule="auto"/>
             </w:pPr>
             <w:r>
+              <w:lastRenderedPageBreak/>
               <w:t>TC-5</w:t>
             </w:r>
           </w:p>
@@ -7601,11 +7576,7 @@
               <w:spacing w:after="0" w:line="240" w:lineRule="auto"/>
             </w:pPr>
             <w:r>
-              <w:t xml:space="preserve">Validate usability on supported </w:t>
-            </w:r>
-            <w:r>
-              <w:lastRenderedPageBreak/>
-              <w:t>phone sizes.</w:t>
+              <w:t>Validate usability on supported phone sizes.</w:t>
             </w:r>
           </w:p>
         </w:tc>
@@ -7626,12 +7597,7 @@
               <w:spacing w:after="0" w:line="240" w:lineRule="auto"/>
             </w:pPr>
             <w:r>
-              <w:lastRenderedPageBreak/>
-              <w:t xml:space="preserve">1. Open screens on target resolutions. 2. Check </w:t>
-            </w:r>
-            <w:r>
-              <w:lastRenderedPageBreak/>
-              <w:t>layout and controls.</w:t>
+              <w:t>1. Open screens on target resolutions. 2. Check layout and controls.</w:t>
             </w:r>
           </w:p>
         </w:tc>
@@ -7652,12 +7618,7 @@
               <w:spacing w:after="0" w:line="240" w:lineRule="auto"/>
             </w:pPr>
             <w:r>
-              <w:lastRenderedPageBreak/>
-              <w:t xml:space="preserve">UI remains readable, accessible, and </w:t>
-            </w:r>
-            <w:r>
-              <w:lastRenderedPageBreak/>
-              <w:t>functional.</w:t>
+              <w:t>UI remains readable, accessible, and functional.</w:t>
             </w:r>
           </w:p>
         </w:tc>
@@ -7678,7 +7639,6 @@
               <w:spacing w:after="0" w:line="240" w:lineRule="auto"/>
             </w:pPr>
             <w:r>
-              <w:lastRenderedPageBreak/>
               <w:t>Planned</w:t>
             </w:r>
           </w:p>
@@ -9101,6 +9061,7 @@
                 <w:color w:val="FFFFFF"/>
                 <w:sz w:val="16"/>
               </w:rPr>
+              <w:lastRenderedPageBreak/>
               <w:t>TC-ID</w:t>
             </w:r>
           </w:p>
@@ -9309,11 +9270,7 @@
               <w:spacing w:after="0" w:line="240" w:lineRule="auto"/>
             </w:pPr>
             <w:r>
-              <w:t xml:space="preserve">Verify encryption of app-device/cloud communications </w:t>
-            </w:r>
-            <w:r>
-              <w:lastRenderedPageBreak/>
-              <w:t>where supported.</w:t>
+              <w:t>Verify encryption of app-device/cloud communications where supported.</w:t>
             </w:r>
           </w:p>
         </w:tc>
@@ -9334,7 +9291,6 @@
               <w:spacing w:after="0" w:line="240" w:lineRule="auto"/>
             </w:pPr>
             <w:r>
-              <w:lastRenderedPageBreak/>
               <w:t>1. Inspect BLE/Wi-Fi/API traffic. 2. Review transport configuration.</w:t>
             </w:r>
           </w:p>
@@ -9356,11 +9312,7 @@
               <w:spacing w:after="0" w:line="240" w:lineRule="auto"/>
             </w:pPr>
             <w:r>
-              <w:t xml:space="preserve">Sensitive data is not exposed in plain text beyond intended local </w:t>
-            </w:r>
-            <w:r>
-              <w:lastRenderedPageBreak/>
-              <w:t>channels.</w:t>
+              <w:t>Sensitive data is not exposed in plain text beyond intended local channels.</w:t>
             </w:r>
           </w:p>
         </w:tc>
@@ -9381,7 +9333,6 @@
               <w:spacing w:after="0" w:line="240" w:lineRule="auto"/>
             </w:pPr>
             <w:r>
-              <w:lastRenderedPageBreak/>
               <w:t>Planned</w:t>
             </w:r>
           </w:p>
@@ -11017,6 +10968,7 @@
               <w:spacing w:after="0" w:line="240" w:lineRule="auto"/>
             </w:pPr>
             <w:r>
+              <w:lastRenderedPageBreak/>
               <w:t>TC-3</w:t>
             </w:r>
           </w:p>
@@ -11059,11 +11011,7 @@
               <w:spacing w:after="0" w:line="240" w:lineRule="auto"/>
             </w:pPr>
             <w:r>
-              <w:t xml:space="preserve">Assess onboarding, pairing, and routine </w:t>
-            </w:r>
-            <w:r>
-              <w:lastRenderedPageBreak/>
-              <w:t>use.</w:t>
+              <w:t>Assess onboarding, pairing, and routine use.</w:t>
             </w:r>
           </w:p>
         </w:tc>
@@ -11084,12 +11032,7 @@
               <w:spacing w:after="0" w:line="240" w:lineRule="auto"/>
             </w:pPr>
             <w:r>
-              <w:lastRenderedPageBreak/>
-              <w:t xml:space="preserve">1. Give new user a short task list. 2. Observe </w:t>
-            </w:r>
-            <w:r>
-              <w:lastRenderedPageBreak/>
-              <w:t>completion.</w:t>
+              <w:t>1. Give new user a short task list. 2. Observe completion.</w:t>
             </w:r>
           </w:p>
         </w:tc>
@@ -11110,12 +11053,7 @@
               <w:spacing w:after="0" w:line="240" w:lineRule="auto"/>
             </w:pPr>
             <w:r>
-              <w:lastRenderedPageBreak/>
-              <w:t xml:space="preserve">Users can complete common tasks without </w:t>
-            </w:r>
-            <w:r>
-              <w:lastRenderedPageBreak/>
-              <w:t>heavy assistance.</w:t>
+              <w:t>Users can complete common tasks without heavy assistance.</w:t>
             </w:r>
           </w:p>
         </w:tc>
@@ -11136,7 +11074,6 @@
               <w:spacing w:after="0" w:line="240" w:lineRule="auto"/>
             </w:pPr>
             <w:r>
-              <w:lastRenderedPageBreak/>
               <w:t>Planned</w:t>
             </w:r>
           </w:p>
@@ -12302,11 +12239,8 @@
               <w:spacing w:after="0"/>
             </w:pPr>
             <w:r>
-              <w:t xml:space="preserve">BO-05 / Open-source </w:t>
-            </w:r>
-            <w:r>
               <w:lastRenderedPageBreak/>
-              <w:t>applicability</w:t>
+              <w:t>BO-05 / Open-source applicability</w:t>
             </w:r>
           </w:p>
         </w:tc>
@@ -12327,12 +12261,7 @@
               <w:spacing w:after="0"/>
             </w:pPr>
             <w:r>
-              <w:lastRenderedPageBreak/>
-              <w:t xml:space="preserve">Configuration, logging, and </w:t>
-            </w:r>
-            <w:r>
-              <w:lastRenderedPageBreak/>
-              <w:t>traceable test evidence</w:t>
+              <w:t>Configuration, logging, and traceable test evidence</w:t>
             </w:r>
           </w:p>
         </w:tc>
@@ -12353,12 +12282,7 @@
               <w:spacing w:after="0"/>
             </w:pPr>
             <w:r>
-              <w:lastRenderedPageBreak/>
-              <w:t xml:space="preserve">Ensures reproducible builds, </w:t>
-            </w:r>
-            <w:r>
-              <w:lastRenderedPageBreak/>
-              <w:t>documented behavior, and repeatable verification steps</w:t>
+              <w:t>Ensures reproducible builds, documented behavior, and repeatable verification steps</w:t>
             </w:r>
           </w:p>
         </w:tc>
@@ -12384,7 +12308,6 @@
               <w:spacing w:after="0"/>
             </w:pPr>
             <w:r>
-              <w:lastRenderedPageBreak/>
               <w:t>BO-06 / Usability testing</w:t>
             </w:r>
           </w:p>
@@ -12856,6 +12779,7 @@
         </w:numPr>
       </w:pPr>
       <w:r>
+        <w:lastRenderedPageBreak/>
         <w:t>Final QA summary report with pass/fail status, residual issues, and recommendations</w:t>
       </w:r>
     </w:p>
@@ -12864,7 +12788,6 @@
         <w:pStyle w:val="Heading1"/>
       </w:pPr>
       <w:r>
-        <w:lastRenderedPageBreak/>
         <w:t>7. Conclusion</w:t>
       </w:r>
     </w:p>

</xml_diff>